<commit_message>
Expand Post 5 (devotee post) with an earlier fragment of the same idea
Add the lecture's earlier statement of "teacher is foremost a disciple"
(~47:19-48:27) as a clearly marked supplementary fragment ahead of the
post's continuous backbone (~58:32-1:00:00, extended to its natural
closing sentence), per the softened §6b rule.

Co-Authored-By: Claude Sonnet 5 <noreply@anthropic.com>
Claude-Session: https://claude.ai/code/session_0191oBghnP17rwTFx3hL6sTu
</commit_message>
<xml_diff>
--- a/posts/13_posty_VK_guru_i_uchenik_svetskie.docx
+++ b/posts/13_posty_VK_guru_i_uchenik_svetskie.docx
@@ -668,7 +668,67 @@
         <w:spacing w:after="100" w:before="200"/>
       </w:pPr>
       <w:r>
-        <w:t xml:space="preserve">Пост 5 [для преданных]. Преемственность называется ученической, а не учительской</w:t>
+        <w:t xml:space="preserve">Пост 5 [для преданных] (расширенный). Преемственность называется ученической, а не учительской</w:t>
+      </w:r>
+    </w:p>
+    <w:p>
+      <w:pPr>
+        <w:spacing w:after="80"/>
+      </w:pPr>
+    </w:p>
+    <w:p>
+      <w:pPr>
+        <w:spacing w:after="60"/>
+      </w:pPr>
+      <w:r>
+        <w:rPr>
+          <w:i/>
+          <w:iCs/>
+        </w:rPr>
+        <w:t xml:space="preserve">Чуть раньше в этой же лекции Гуру Махарадж уже затрагивал эту мысль — вот с чего она начиналась.</w:t>
+      </w:r>
+    </w:p>
+    <w:p>
+      <w:pPr>
+        <w:spacing w:after="80"/>
+      </w:pPr>
+    </w:p>
+    <w:p>
+      <w:pPr>
+        <w:spacing w:after="60"/>
+      </w:pPr>
+      <w:r>
+        <w:t xml:space="preserve">Духовный учитель является тем, кто сам является учеником. Очень важный момент. Только тот, кто сам является учеником, — то есть сам пробудил свою вечную духовную склонность к ученичеству, к постоянному развитию, — может передать эту склонность, пробудить её в ученике. А если он сам правдами-неправдами занял положение, пытается демонстрировать из себя учителя, привязан к этой роли, но не привязан к роли развития, ученичества, — это означает, что это ложный учитель. Он будет просто пытаться наслаждаться этой ролью свысока.</w:t>
+      </w:r>
+    </w:p>
+    <w:p>
+      <w:pPr>
+        <w:spacing w:after="80"/>
+      </w:pPr>
+    </w:p>
+    <w:p>
+      <w:pPr>
+        <w:spacing w:after="60"/>
+      </w:pPr>
+      <w:r>
+        <w:t xml:space="preserve">Но учитель всегда считает себя слугой и учеником. Он слуга своего духовного учителя и слуга Кришны. И он пытается этому же научить своих учеников и смотрит на них тоже как на слуг Кришны, не как на свою собственность.</w:t>
+      </w:r>
+    </w:p>
+    <w:p>
+      <w:pPr>
+        <w:spacing w:after="80"/>
+      </w:pPr>
+    </w:p>
+    <w:p>
+      <w:pPr>
+        <w:spacing w:after="60"/>
+      </w:pPr>
+      <w:r>
+        <w:rPr>
+          <w:i/>
+          <w:iCs/>
+        </w:rPr>
+        <w:t xml:space="preserve">А вот как эта же мысль раскрывается дальше в лекции — уже глубже.</w:t>
       </w:r>
     </w:p>
     <w:p>
@@ -694,7 +754,7 @@
         <w:spacing w:after="60"/>
       </w:pPr>
       <w:r>
-        <w:t xml:space="preserve">Но его главная природа — быть учеником. Потому что как только он перестаёт быть учеником, как только он теряет это качество, он становится лжегуру. Он внешне играет из себя учителя, привязывается к этой роли, зацикливается и зацикливает ученика на себе. Тогда как истинный учитель ведёт людей к Кришне — он помогает им встать, снять эту повязку и обрести опять зрение, стать свободной душой. В этом смысл. Потому что пока человек не станет свободной душой, он не может вступать в отношения, основанные на любви, — ведь любовь происходит только на платформе свободы.</w:t>
+        <w:t xml:space="preserve">Но его главная природа — быть учеником. Потому что как только он перестаёт быть учеником, как только он теряет это качество, он становится лжегуру. Он внешне играет из себя учителя, привязывается к этой роли, зацикливается и зацикливает ученика на себе. Тогда как истинный учитель ведёт людей к Кришне — он помогает им встать, снять эту повязку и обрести опять зрение, стать свободной душой. В этом смысл. Потому что пока человек не станет свободной душой, он не может вступать в отношения, основанные на любви, — ведь любовь происходит только на платформе свободы. Так человек учится любить, учится правильным взаимоотношениям. Это, собственно, часть процесса обучения.</w:t>
       </w:r>
     </w:p>
     <w:p>
@@ -715,7 +775,15 @@
         <w:spacing w:after="60"/>
       </w:pPr>
       <w:r>
-        <w:t xml:space="preserve">🔹 Лекция: «А нужен ли Гуру?» (09.08.2026, Южно-Сахалинск) · ссылка: youtube.com/watch?v=G1CYFanHWhc · таймкод ~58:32–1:00:00</w:t>
+        <w:t xml:space="preserve">🔹 Лекция: «А нужен ли Гуру?» (09.08.2026, Южно-Сахалинск) · ссылка: youtube.com/watch?v=G1CYFanHWhc</w:t>
+      </w:r>
+    </w:p>
+    <w:p>
+      <w:pPr>
+        <w:spacing w:after="60"/>
+      </w:pPr>
+      <w:r>
+        <w:t xml:space="preserve">🔹 Основной отрезок: ~58:32–1:00:00 · дополнительный отрезок (вступление к той же мысли): ~47:19–48:27</w:t>
       </w:r>
     </w:p>
     <w:p>
@@ -732,6 +800,14 @@
       </w:pPr>
       <w:r>
         <w:t xml:space="preserve">💬 Почему «для преданных»: опирается на специфическое понятие ученической преемственности в гаудия-вайшнавизме и прямую отсылку к Кришне как цели духовного пути — глубже, чем нужно светскому читателю без контекста традиции.</w:t>
+      </w:r>
+    </w:p>
+    <w:p>
+      <w:pPr>
+        <w:spacing w:after="60"/>
+      </w:pPr>
+      <w:r>
+        <w:t xml:space="preserve">📝 По правилу об объединении цитат (CLAUDE.md §6b): основа поста — непрерывный отрезок ~58:32–1:00:00 (доведён до естественного завершения мысли); к нему добавлен один более ранний фрагмент той же лекции, где звучит первая, более короткая формулировка этой же идеи — он явно отделён и помечен отдельным таймкодом.</w:t>
       </w:r>
     </w:p>
     <w:p>

</xml_diff>

<commit_message>
Add §11: post value as a soft aspirational principle (not a rule)
Record in CLAUDE.md and the project summary that a post should ideally
leave the reader with a sense of direct (actionable) or indirect
(inherently valuable/moving) benefit, not just end as information with
no payoff. Explicitly framed as guidance, not a formatting mandate or
restriction — and any added closing thought must stay clearly separate
from the quoted material, as the editor's own framing, never presented
as Guru Maharaj's words (keeps §6 sourced-only policy intact).

Apply it to the flagged example (posts/13 Post 3, "Три желания"): add a
short, clearly-marked "От редакции" reflective question after the quote,
plus an internal "🎯 Польза поста" footer note.

Co-Authored-By: Claude Sonnet 5 <noreply@anthropic.com>
Claude-Session: https://claude.ai/code/session_0191oBghnP17rwTFx3hL6sTu
</commit_message>
<xml_diff>
--- a/posts/13_posty_VK_guru_i_uchenik_svetskie.docx
+++ b/posts/13_posty_VK_guru_i_uchenik_svetskie.docx
@@ -510,6 +510,26 @@
         <w:spacing w:after="60"/>
       </w:pPr>
       <w:r>
+        <w:rPr>
+          <w:i/>
+          <w:iCs/>
+        </w:rPr>
+        <w:t xml:space="preserve">От редакции:</w:t>
+      </w:r>
+      <w:r>
+        <w:t xml:space="preserve"> три простых вопроса на сегодня — что на самом деле делает меня счастливым, что мне по-настоящему интересно узнать и ради чего я держусь за привычное? Иногда в ответах на них — больше о нас самих, чем кажется.</w:t>
+      </w:r>
+    </w:p>
+    <w:p>
+      <w:pPr>
+        <w:spacing w:after="80"/>
+      </w:pPr>
+    </w:p>
+    <w:p>
+      <w:pPr>
+        <w:spacing w:after="60"/>
+      </w:pPr>
+      <w:r>
         <w:t xml:space="preserve">——</w:t>
       </w:r>
     </w:p>
@@ -527,6 +547,14 @@
       </w:pPr>
       <w:r>
         <w:t xml:space="preserve">🔸 Статус: черновик до сверки с аудио</w:t>
+      </w:r>
+    </w:p>
+    <w:p>
+      <w:pPr>
+        <w:spacing w:after="60"/>
+      </w:pPr>
+      <w:r>
+        <w:t xml:space="preserve">🎯 Польза поста: косвенная — три желания легко узнать в себе; вопросы в конце переводят наблюдение в лёгкую саморефлексию (§11 CLAUDE.md).</w:t>
       </w:r>
     </w:p>
     <w:p>

</xml_diff>